<commit_message>
Completed the short report.
</commit_message>
<xml_diff>
--- a/GDV4002-base 1 Short Report.docx
+++ b/GDV4002-base 1 Short Report.docx
@@ -2,7 +2,263 @@
 <file path=word/document.xml><?xml version="1.0" encoding="utf-8"?>
 <w:document xmlns:wpc="http://schemas.microsoft.com/office/word/2010/wordprocessingCanvas" xmlns:cx="http://schemas.microsoft.com/office/drawing/2014/chartex" xmlns:cx1="http://schemas.microsoft.com/office/drawing/2015/9/8/chartex" xmlns:cx2="http://schemas.microsoft.com/office/drawing/2015/10/21/chartex" xmlns:cx3="http://schemas.microsoft.com/office/drawing/2016/5/9/chartex" xmlns:cx4="http://schemas.microsoft.com/office/drawing/2016/5/10/chartex" xmlns:cx5="http://schemas.microsoft.com/office/drawing/2016/5/11/chartex" xmlns:cx6="http://schemas.microsoft.com/office/drawing/2016/5/12/chartex" xmlns:cx7="http://schemas.microsoft.com/office/drawing/2016/5/13/chartex" xmlns:cx8="http://schemas.microsoft.com/office/drawing/2016/5/14/chartex" xmlns:mc="http://schemas.openxmlformats.org/markup-compatibility/2006" xmlns:aink="http://schemas.microsoft.com/office/drawing/2016/ink" xmlns:am3d="http://schemas.microsoft.com/office/drawing/2017/model3d" xmlns:o="urn:schemas-microsoft-com:office:office" xmlns:oel="http://schemas.microsoft.com/office/2019/extlst" xmlns:r="http://schemas.openxmlformats.org/officeDocument/2006/relationships" xmlns:m="http://schemas.openxmlformats.org/officeDocument/2006/math" xmlns:v="urn:schemas-microsoft-com:vml" xmlns:wp14="http://schemas.microsoft.com/office/word/2010/wordprocessingDrawing" xmlns:wp="http://schemas.openxmlformats.org/drawingml/2006/wordprocessingDrawing" xmlns:w10="urn:schemas-microsoft-com:office:word" xmlns:w="http://schemas.openxmlformats.org/wordprocessingml/2006/main" xmlns:w14="http://schemas.microsoft.com/office/word/2010/wordml" xmlns:w15="http://schemas.microsoft.com/office/word/2012/wordml" xmlns:w16cex="http://schemas.microsoft.com/office/word/2018/wordml/cex" xmlns:w16cid="http://schemas.microsoft.com/office/word/2016/wordml/cid" xmlns:w16="http://schemas.microsoft.com/office/word/2018/wordml" xmlns:w16du="http://schemas.microsoft.com/office/word/2023/wordml/word16du" xmlns:w16sdtdh="http://schemas.microsoft.com/office/word/2020/wordml/sdtdatahash" xmlns:w16sdtfl="http://schemas.microsoft.com/office/word/2024/wordml/sdtformatlock" xmlns:w16se="http://schemas.microsoft.com/office/word/2015/wordml/symex" xmlns:wpg="http://schemas.microsoft.com/office/word/2010/wordprocessingGroup" xmlns:wpi="http://schemas.microsoft.com/office/word/2010/wordprocessingInk" xmlns:wne="http://schemas.microsoft.com/office/word/2006/wordml" xmlns:wps="http://schemas.microsoft.com/office/word/2010/wordprocessingShape" mc:Ignorable="w14 w15 w16se w16cid w16 w16cex w16sdtdh w16sdtfl w16du wp14">
   <w:body>
+    <w:p>
+      <w:pPr>
+        <w:rPr>
+          <w:sz w:val="22"/>
+          <w:szCs w:val="22"/>
+        </w:rPr>
+      </w:pPr>
+      <w:r>
+        <w:rPr>
+          <w:sz w:val="22"/>
+          <w:szCs w:val="22"/>
+        </w:rPr>
+        <w:t>Tom Pugh st20325547 GDV4002-base1</w:t>
+      </w:r>
+    </w:p>
+    <w:p>
+      <w:pPr>
+        <w:rPr>
+          <w:b/>
+          <w:bCs/>
+          <w:sz w:val="28"/>
+          <w:szCs w:val="28"/>
+        </w:rPr>
+      </w:pPr>
+      <w:r>
+        <w:rPr>
+          <w:b/>
+          <w:bCs/>
+          <w:sz w:val="28"/>
+          <w:szCs w:val="28"/>
+        </w:rPr>
+        <w:t>Game Object Design Overview</w:t>
+      </w:r>
+    </w:p>
+    <w:p>
+      <w:r>
+        <w:t>This report will explain how the player, asteroid, and bullet objects were designed and what data they use</w:t>
+      </w:r>
+      <w:r>
+        <w:t>.</w:t>
+      </w:r>
+    </w:p>
+    <w:p>
+      <w:r>
+        <w:t>All game objects are created from a base class (GameObject2D), which holds multiple shared features such as position, rotation and updating. This helps to avoid repeated code and keeps the project better organised.</w:t>
+      </w:r>
+    </w:p>
     <w:p/>
+    <w:p>
+      <w:pPr>
+        <w:rPr>
+          <w:b/>
+          <w:bCs/>
+          <w:sz w:val="28"/>
+          <w:szCs w:val="28"/>
+        </w:rPr>
+      </w:pPr>
+      <w:r>
+        <w:rPr>
+          <w:b/>
+          <w:bCs/>
+          <w:sz w:val="28"/>
+          <w:szCs w:val="28"/>
+        </w:rPr>
+        <w:t>Player Object</w:t>
+      </w:r>
+    </w:p>
+    <w:p>
+      <w:r>
+        <w:t xml:space="preserve">The player object is the ship that’s controlled by the user. Its position is stored using </w:t>
+      </w:r>
+      <w:proofErr w:type="spellStart"/>
+      <w:proofErr w:type="gramStart"/>
+      <w:r>
+        <w:t>glm</w:t>
+      </w:r>
+      <w:proofErr w:type="spellEnd"/>
+      <w:r>
+        <w:t>::</w:t>
+      </w:r>
+      <w:proofErr w:type="gramEnd"/>
+      <w:r>
+        <w:t>vec2 which helps handle 2D movement. The player’s orientation is stored as a float, and that allows smooth rotation and movement in any direction.</w:t>
+      </w:r>
+    </w:p>
+    <w:p>
+      <w:r>
+        <w:t>It also stores a movement speed in float and a texture ID for rendering.</w:t>
+      </w:r>
+      <w:r>
+        <w:t xml:space="preserve"> The player is responsible for movement and shooting so when the user presses the Space key, a bullet is fired from the player’s position.</w:t>
+      </w:r>
+    </w:p>
+    <w:p/>
+    <w:p>
+      <w:pPr>
+        <w:rPr>
+          <w:b/>
+          <w:bCs/>
+          <w:sz w:val="28"/>
+          <w:szCs w:val="28"/>
+        </w:rPr>
+      </w:pPr>
+      <w:r>
+        <w:rPr>
+          <w:b/>
+          <w:bCs/>
+          <w:sz w:val="28"/>
+          <w:szCs w:val="28"/>
+        </w:rPr>
+        <w:t>Asteroid Object</w:t>
+      </w:r>
+    </w:p>
+    <w:p>
+      <w:r>
+        <w:t xml:space="preserve">The asteroid object represents real asteroids that fly around the screen. Like the player, it uses </w:t>
+      </w:r>
+      <w:proofErr w:type="spellStart"/>
+      <w:proofErr w:type="gramStart"/>
+      <w:r>
+        <w:t>glm</w:t>
+      </w:r>
+      <w:proofErr w:type="spellEnd"/>
+      <w:r>
+        <w:t>::</w:t>
+      </w:r>
+      <w:proofErr w:type="gramEnd"/>
+      <w:r>
+        <w:t>vec2 for position and size, and a float for rotation and movement speed. Once again, using floating point values allows a smooth motion.</w:t>
+      </w:r>
+    </w:p>
+    <w:p>
+      <w:r>
+        <w:t xml:space="preserve">When the asteroid goes past the screen width, it wraps back around </w:t>
+      </w:r>
+      <w:r>
+        <w:t>to create a cool scene as there are multiple different asteroids going different speeds, rotations and sizes.</w:t>
+      </w:r>
+    </w:p>
+    <w:p/>
+    <w:p>
+      <w:pPr>
+        <w:rPr>
+          <w:b/>
+          <w:bCs/>
+          <w:sz w:val="28"/>
+          <w:szCs w:val="28"/>
+        </w:rPr>
+      </w:pPr>
+      <w:r>
+        <w:rPr>
+          <w:b/>
+          <w:bCs/>
+          <w:sz w:val="28"/>
+          <w:szCs w:val="28"/>
+        </w:rPr>
+        <w:t>Bullet Object</w:t>
+      </w:r>
+    </w:p>
+    <w:p>
+      <w:r>
+        <w:t xml:space="preserve">The bullet object represents projectiles fired by the player. Once again it stores position and orientation using </w:t>
+      </w:r>
+      <w:proofErr w:type="spellStart"/>
+      <w:proofErr w:type="gramStart"/>
+      <w:r>
+        <w:t>glm</w:t>
+      </w:r>
+      <w:proofErr w:type="spellEnd"/>
+      <w:r>
+        <w:t>::</w:t>
+      </w:r>
+      <w:proofErr w:type="gramEnd"/>
+      <w:r>
+        <w:t>vec2 and float, ensuring bullets travel in the correct direction that the player is facing. Bullet speed is stored as a float, allowing consistent movement.</w:t>
+      </w:r>
+    </w:p>
+    <w:p/>
+    <w:p>
+      <w:pPr>
+        <w:rPr>
+          <w:b/>
+          <w:bCs/>
+        </w:rPr>
+      </w:pPr>
+      <w:r>
+        <w:rPr>
+          <w:b/>
+          <w:bCs/>
+        </w:rPr>
+        <w:t>Appendix</w:t>
+      </w:r>
+    </w:p>
+    <w:p>
+      <w:pPr>
+        <w:pStyle w:val="ListParagraph"/>
+        <w:numPr>
+          <w:ilvl w:val="0"/>
+          <w:numId w:val="1"/>
+        </w:numPr>
+        <w:rPr>
+          <w:b/>
+          <w:bCs/>
+        </w:rPr>
+      </w:pPr>
+      <w:r>
+        <w:rPr>
+          <w:b/>
+          <w:bCs/>
+        </w:rPr>
+        <w:t>Video Demo:</w:t>
+      </w:r>
+    </w:p>
+    <w:p>
+      <w:pPr>
+        <w:pStyle w:val="ListParagraph"/>
+        <w:numPr>
+          <w:ilvl w:val="0"/>
+          <w:numId w:val="1"/>
+        </w:numPr>
+        <w:rPr>
+          <w:b/>
+          <w:bCs/>
+        </w:rPr>
+      </w:pPr>
+      <w:r>
+        <w:rPr>
+          <w:b/>
+          <w:bCs/>
+        </w:rPr>
+        <w:lastRenderedPageBreak/>
+        <w:t xml:space="preserve">Source Control </w:t>
+      </w:r>
+      <w:proofErr w:type="spellStart"/>
+      <w:r>
+        <w:rPr>
+          <w:b/>
+          <w:bCs/>
+        </w:rPr>
+        <w:t>Repositry</w:t>
+      </w:r>
+      <w:proofErr w:type="spellEnd"/>
+      <w:r>
+        <w:rPr>
+          <w:b/>
+          <w:bCs/>
+        </w:rPr>
+        <w:t xml:space="preserve">: </w:t>
+      </w:r>
+      <w:r>
+        <w:rPr>
+          <w:b/>
+          <w:bCs/>
+        </w:rPr>
+        <w:t>https://github.com/TomPugh808/gdv4002-base1/tree/main</w:t>
+      </w:r>
+    </w:p>
     <w:sectPr>
       <w:pgSz w:w="11906" w:h="16838"/>
       <w:pgMar w:top="1440" w:right="1440" w:bottom="1440" w:left="1440" w:header="708" w:footer="708" w:gutter="0"/>
@@ -11,6 +267,127 @@
     </w:sectPr>
   </w:body>
 </w:document>
+</file>
+
+<file path=word/numbering.xml><?xml version="1.0" encoding="utf-8"?>
+<w:numbering xmlns:wpc="http://schemas.microsoft.com/office/word/2010/wordprocessingCanvas" xmlns:cx="http://schemas.microsoft.com/office/drawing/2014/chartex" xmlns:cx1="http://schemas.microsoft.com/office/drawing/2015/9/8/chartex" xmlns:cx2="http://schemas.microsoft.com/office/drawing/2015/10/21/chartex" xmlns:cx3="http://schemas.microsoft.com/office/drawing/2016/5/9/chartex" xmlns:cx4="http://schemas.microsoft.com/office/drawing/2016/5/10/chartex" xmlns:cx5="http://schemas.microsoft.com/office/drawing/2016/5/11/chartex" xmlns:cx6="http://schemas.microsoft.com/office/drawing/2016/5/12/chartex" xmlns:cx7="http://schemas.microsoft.com/office/drawing/2016/5/13/chartex" xmlns:cx8="http://schemas.microsoft.com/office/drawing/2016/5/14/chartex" xmlns:mc="http://schemas.openxmlformats.org/markup-compatibility/2006" xmlns:aink="http://schemas.microsoft.com/office/drawing/2016/ink" xmlns:am3d="http://schemas.microsoft.com/office/drawing/2017/model3d" xmlns:o="urn:schemas-microsoft-com:office:office" xmlns:oel="http://schemas.microsoft.com/office/2019/extlst" xmlns:r="http://schemas.openxmlformats.org/officeDocument/2006/relationships" xmlns:m="http://schemas.openxmlformats.org/officeDocument/2006/math" xmlns:v="urn:schemas-microsoft-com:vml" xmlns:wp14="http://schemas.microsoft.com/office/word/2010/wordprocessingDrawing" xmlns:wp="http://schemas.openxmlformats.org/drawingml/2006/wordprocessingDrawing" xmlns:w10="urn:schemas-microsoft-com:office:word" xmlns:w="http://schemas.openxmlformats.org/wordprocessingml/2006/main" xmlns:w14="http://schemas.microsoft.com/office/word/2010/wordml" xmlns:w15="http://schemas.microsoft.com/office/word/2012/wordml" xmlns:w16cex="http://schemas.microsoft.com/office/word/2018/wordml/cex" xmlns:w16cid="http://schemas.microsoft.com/office/word/2016/wordml/cid" xmlns:w16="http://schemas.microsoft.com/office/word/2018/wordml" xmlns:w16du="http://schemas.microsoft.com/office/word/2023/wordml/word16du" xmlns:w16sdtdh="http://schemas.microsoft.com/office/word/2020/wordml/sdtdatahash" xmlns:w16sdtfl="http://schemas.microsoft.com/office/word/2024/wordml/sdtformatlock" xmlns:w16se="http://schemas.microsoft.com/office/word/2015/wordml/symex" xmlns:wpg="http://schemas.microsoft.com/office/word/2010/wordprocessingGroup" xmlns:wpi="http://schemas.microsoft.com/office/word/2010/wordprocessingInk" xmlns:wne="http://schemas.microsoft.com/office/word/2006/wordml" xmlns:wps="http://schemas.microsoft.com/office/word/2010/wordprocessingShape" mc:Ignorable="w14 w15 w16se w16cid w16 w16cex w16sdtdh w16sdtfl w16du wp14">
+  <w:abstractNum w:abstractNumId="0" w15:restartNumberingAfterBreak="0">
+    <w:nsid w:val="6E8B189D"/>
+    <w:multiLevelType w:val="hybridMultilevel"/>
+    <w:tmpl w:val="D8140CC0"/>
+    <w:lvl w:ilvl="0" w:tplc="08090001">
+      <w:start w:val="1"/>
+      <w:numFmt w:val="bullet"/>
+      <w:lvlText w:val=""/>
+      <w:lvlJc w:val="left"/>
+      <w:pPr>
+        <w:ind w:left="720" w:hanging="360"/>
+      </w:pPr>
+      <w:rPr>
+        <w:rFonts w:ascii="Symbol" w:hAnsi="Symbol" w:hint="default"/>
+      </w:rPr>
+    </w:lvl>
+    <w:lvl w:ilvl="1" w:tplc="08090003" w:tentative="1">
+      <w:start w:val="1"/>
+      <w:numFmt w:val="bullet"/>
+      <w:lvlText w:val="o"/>
+      <w:lvlJc w:val="left"/>
+      <w:pPr>
+        <w:ind w:left="1440" w:hanging="360"/>
+      </w:pPr>
+      <w:rPr>
+        <w:rFonts w:ascii="Courier New" w:hAnsi="Courier New" w:cs="Courier New" w:hint="default"/>
+      </w:rPr>
+    </w:lvl>
+    <w:lvl w:ilvl="2" w:tplc="08090005" w:tentative="1">
+      <w:start w:val="1"/>
+      <w:numFmt w:val="bullet"/>
+      <w:lvlText w:val=""/>
+      <w:lvlJc w:val="left"/>
+      <w:pPr>
+        <w:ind w:left="2160" w:hanging="360"/>
+      </w:pPr>
+      <w:rPr>
+        <w:rFonts w:ascii="Wingdings" w:hAnsi="Wingdings" w:hint="default"/>
+      </w:rPr>
+    </w:lvl>
+    <w:lvl w:ilvl="3" w:tplc="08090001" w:tentative="1">
+      <w:start w:val="1"/>
+      <w:numFmt w:val="bullet"/>
+      <w:lvlText w:val=""/>
+      <w:lvlJc w:val="left"/>
+      <w:pPr>
+        <w:ind w:left="2880" w:hanging="360"/>
+      </w:pPr>
+      <w:rPr>
+        <w:rFonts w:ascii="Symbol" w:hAnsi="Symbol" w:hint="default"/>
+      </w:rPr>
+    </w:lvl>
+    <w:lvl w:ilvl="4" w:tplc="08090003" w:tentative="1">
+      <w:start w:val="1"/>
+      <w:numFmt w:val="bullet"/>
+      <w:lvlText w:val="o"/>
+      <w:lvlJc w:val="left"/>
+      <w:pPr>
+        <w:ind w:left="3600" w:hanging="360"/>
+      </w:pPr>
+      <w:rPr>
+        <w:rFonts w:ascii="Courier New" w:hAnsi="Courier New" w:cs="Courier New" w:hint="default"/>
+      </w:rPr>
+    </w:lvl>
+    <w:lvl w:ilvl="5" w:tplc="08090005" w:tentative="1">
+      <w:start w:val="1"/>
+      <w:numFmt w:val="bullet"/>
+      <w:lvlText w:val=""/>
+      <w:lvlJc w:val="left"/>
+      <w:pPr>
+        <w:ind w:left="4320" w:hanging="360"/>
+      </w:pPr>
+      <w:rPr>
+        <w:rFonts w:ascii="Wingdings" w:hAnsi="Wingdings" w:hint="default"/>
+      </w:rPr>
+    </w:lvl>
+    <w:lvl w:ilvl="6" w:tplc="08090001" w:tentative="1">
+      <w:start w:val="1"/>
+      <w:numFmt w:val="bullet"/>
+      <w:lvlText w:val=""/>
+      <w:lvlJc w:val="left"/>
+      <w:pPr>
+        <w:ind w:left="5040" w:hanging="360"/>
+      </w:pPr>
+      <w:rPr>
+        <w:rFonts w:ascii="Symbol" w:hAnsi="Symbol" w:hint="default"/>
+      </w:rPr>
+    </w:lvl>
+    <w:lvl w:ilvl="7" w:tplc="08090003" w:tentative="1">
+      <w:start w:val="1"/>
+      <w:numFmt w:val="bullet"/>
+      <w:lvlText w:val="o"/>
+      <w:lvlJc w:val="left"/>
+      <w:pPr>
+        <w:ind w:left="5760" w:hanging="360"/>
+      </w:pPr>
+      <w:rPr>
+        <w:rFonts w:ascii="Courier New" w:hAnsi="Courier New" w:cs="Courier New" w:hint="default"/>
+      </w:rPr>
+    </w:lvl>
+    <w:lvl w:ilvl="8" w:tplc="08090005" w:tentative="1">
+      <w:start w:val="1"/>
+      <w:numFmt w:val="bullet"/>
+      <w:lvlText w:val=""/>
+      <w:lvlJc w:val="left"/>
+      <w:pPr>
+        <w:ind w:left="6480" w:hanging="360"/>
+      </w:pPr>
+      <w:rPr>
+        <w:rFonts w:ascii="Wingdings" w:hAnsi="Wingdings" w:hint="default"/>
+      </w:rPr>
+    </w:lvl>
+  </w:abstractNum>
+  <w:num w:numId="1" w16cid:durableId="1779056566">
+    <w:abstractNumId w:val="0"/>
+  </w:num>
+</w:numbering>
 </file>
 
 <file path=word/styles.xml><?xml version="1.0" encoding="utf-8"?>

</xml_diff>

<commit_message>
Added youtube link of code demo to the short report doc.
</commit_message>
<xml_diff>
--- a/GDV4002-base 1 Short Report.docx
+++ b/GDV4002-base 1 Short Report.docx
@@ -16,6 +16,13 @@
         </w:rPr>
         <w:t>Tom Pugh st20325547 GDV4002-base1</w:t>
       </w:r>
+      <w:r>
+        <w:rPr>
+          <w:sz w:val="22"/>
+          <w:szCs w:val="22"/>
+        </w:rPr>
+        <w:t xml:space="preserve"> Report</w:t>
+      </w:r>
     </w:p>
     <w:p>
       <w:pPr>
@@ -71,16 +78,17 @@
     </w:p>
     <w:p>
       <w:r>
-        <w:t xml:space="preserve">The player object is the ship that’s controlled by the user. Its position is stored using </w:t>
-      </w:r>
-      <w:proofErr w:type="spellStart"/>
+        <w:t xml:space="preserve">The player object is the </w:t>
+      </w:r>
+      <w:r>
+        <w:t>space</w:t>
+      </w:r>
+      <w:r>
+        <w:t xml:space="preserve">ship that’s controlled by the user. Its position is stored using </w:t>
+      </w:r>
       <w:proofErr w:type="gramStart"/>
       <w:r>
-        <w:t>glm</w:t>
-      </w:r>
-      <w:proofErr w:type="spellEnd"/>
-      <w:r>
-        <w:t>::</w:t>
+        <w:t>glm::</w:t>
       </w:r>
       <w:proofErr w:type="gramEnd"/>
       <w:r>
@@ -119,14 +127,9 @@
       <w:r>
         <w:t xml:space="preserve">The asteroid object represents real asteroids that fly around the screen. Like the player, it uses </w:t>
       </w:r>
-      <w:proofErr w:type="spellStart"/>
       <w:proofErr w:type="gramStart"/>
       <w:r>
-        <w:t>glm</w:t>
-      </w:r>
-      <w:proofErr w:type="spellEnd"/>
-      <w:r>
-        <w:t>::</w:t>
+        <w:t>glm::</w:t>
       </w:r>
       <w:proofErr w:type="gramEnd"/>
       <w:r>
@@ -165,14 +168,9 @@
       <w:r>
         <w:t xml:space="preserve">The bullet object represents projectiles fired by the player. Once again it stores position and orientation using </w:t>
       </w:r>
-      <w:proofErr w:type="spellStart"/>
       <w:proofErr w:type="gramStart"/>
       <w:r>
-        <w:t>glm</w:t>
-      </w:r>
-      <w:proofErr w:type="spellEnd"/>
-      <w:r>
-        <w:t>::</w:t>
+        <w:t>glm::</w:t>
       </w:r>
       <w:proofErr w:type="gramEnd"/>
       <w:r>
@@ -214,6 +212,20 @@
         </w:rPr>
         <w:t>Video Demo:</w:t>
       </w:r>
+      <w:r>
+        <w:rPr>
+          <w:b/>
+          <w:bCs/>
+        </w:rPr>
+        <w:t xml:space="preserve"> </w:t>
+      </w:r>
+      <w:r>
+        <w:rPr>
+          <w:b/>
+          <w:bCs/>
+        </w:rPr>
+        <w:t>https://www.youtube.com/watch?v=q6uPeTiPZU4</w:t>
+      </w:r>
     </w:p>
     <w:p>
       <w:pPr>
@@ -233,23 +245,7 @@
           <w:bCs/>
         </w:rPr>
         <w:lastRenderedPageBreak/>
-        <w:t xml:space="preserve">Source Control </w:t>
-      </w:r>
-      <w:proofErr w:type="spellStart"/>
-      <w:r>
-        <w:rPr>
-          <w:b/>
-          <w:bCs/>
-        </w:rPr>
-        <w:t>Repositry</w:t>
-      </w:r>
-      <w:proofErr w:type="spellEnd"/>
-      <w:r>
-        <w:rPr>
-          <w:b/>
-          <w:bCs/>
-        </w:rPr>
-        <w:t xml:space="preserve">: </w:t>
+        <w:t xml:space="preserve">Source Control Repositry: </w:t>
       </w:r>
       <w:r>
         <w:rPr>
@@ -1307,6 +1303,29 @@
       <w:spacing w:val="5"/>
     </w:rPr>
   </w:style>
+  <w:style w:type="character" w:styleId="Hyperlink">
+    <w:name w:val="Hyperlink"/>
+    <w:basedOn w:val="DefaultParagraphFont"/>
+    <w:uiPriority w:val="99"/>
+    <w:unhideWhenUsed/>
+    <w:rsid w:val="00536CF2"/>
+    <w:rPr>
+      <w:color w:val="467886" w:themeColor="hyperlink"/>
+      <w:u w:val="single"/>
+    </w:rPr>
+  </w:style>
+  <w:style w:type="character" w:styleId="UnresolvedMention">
+    <w:name w:val="Unresolved Mention"/>
+    <w:basedOn w:val="DefaultParagraphFont"/>
+    <w:uiPriority w:val="99"/>
+    <w:semiHidden/>
+    <w:unhideWhenUsed/>
+    <w:rsid w:val="00536CF2"/>
+    <w:rPr>
+      <w:color w:val="605E5C"/>
+      <w:shd w:val="clear" w:color="auto" w:fill="E1DFDD"/>
+    </w:rPr>
+  </w:style>
 </w:styles>
 </file>
 

</xml_diff>